<commit_message>
Rewrite Dyke reflection: deeper education section, 1.15 spacing, 2 full pages
Co-authored-by: fatimai146 <fatimai146@users.noreply.github.com>
</commit_message>
<xml_diff>
--- a/Reflection_Paper_Sept17_Shirley_Dyke.docx
+++ b/Reflection_Paper_Sept17_Shirley_Dyke.docx
@@ -17,7 +17,15 @@
         <w:ind w:firstLine="720"/>
       </w:pPr>
       <w:r>
-        <w:t>What struck me most about Dr. Dyke's lecture was how many unsolved problems she described that are not purely technical. Building a habitat on the moon requires structural engineers, but it also requires people who can think about standards across international partners, logistics under extreme constraints, and how to build an economy around something that does not exist yet. She mentioned that the Italians are building the habitat, Korean agencies are building instrumentation, and dozens of other countries and companies are contributing pieces. Someone has to figure out how all of those pieces connect and how to manage risk when you cannot fully test anything in the actual environment. Those are problems that sit at the intersection of engineering and business, and this lecture made a strong case that the space economy will need people who understand both.</w:t>
+        <w:t>Listening to Dr. Dyke talk about building habitats on the moon, I kept thinking about how unprepared most educational programs are for problems that look like this. This is not a single discipline challenge. It pulls in structural engineering, materials science, robotics, life support systems, international policy, and economics all at once. And the uncomfortable truth is that nobody has done this before, so there is no textbook to follow. The Biosphere 2 example she mentioned made that real. A team of scientists built a sealed environment on Earth, with full control over the design, and it still nearly killed the people inside because of air quality issues nobody anticipated. If we cannot get it right here, doing it on the moon is an entirely different magnitude of difficulty.</w:t>
+      </w:r>
+    </w:p>
+    <w:p>
+      <w:pPr>
+        <w:ind w:firstLine="720"/>
+      </w:pPr>
+      <w:r>
+        <w:t>What this means for education, I think, is that the traditional model of training people deeply in one field and expecting them to figure out the rest on the job is not going to work for challenges at this scale. Dr. Dyke mentioned that the Italians are building the habitat structure, Korean agencies are developing instrumentation, and dozens of other countries are contributing components. Someone has to understand enough about each of those pieces to coordinate them, to anticipate where they will fail to connect, and to build contracts and standards around systems that have never been tested in the real environment. That is not an engineering skill or a business skill in isolation. It is both, and I do not think many programs are set up to teach that combination deliberately.</w:t>
       </w:r>
     </w:p>
     <w:p>
@@ -35,7 +43,15 @@
         <w:ind w:firstLine="720"/>
       </w:pPr>
       <w:r>
-        <w:t>Dr. Dyke made an important distinction between how space programs used to work and how they work now. In the Apollo era, NASA built and controlled everything. Today, NASA is encouraging private companies to take on major roles, not just as contractors but as producers of products that NASA purchases as a customer. The goal is for companies to eventually run the infrastructure themselves. She described a future where fuel could be manufactured from lunar materials and sold to refill rockets on the moon, an entirely new market. Launch costs are falling as companies like SpaceX and Blue Origin drive competition, and as those costs drop, more commercial activity becomes viable. Dr. Lionel also noted that KPMG has published reports on the space economy, which tells you the financial world is already paying attention. For business students, this is not science fiction. It is an emerging market with real investment and real career paths forming now.</w:t>
+        <w:t>The biggest shift Dr. Dyke described was in how NASA operates today compared to the Apollo era. Back then, NASA designed, built, and controlled everything. Now, NASA is positioning itself as a customer. It wants private companies to produce the landers, habitats, and support systems, and eventually to run the infrastructure on their own. That is a fundamentally different business model, and it opens the door for companies to build revenue streams that did not exist before. She described the possibility of manufacturing fuel directly from lunar materials and selling it to refill rockets on the moon. That is not a thought experiment. It is something companies are actively working toward, and it represents the kind of market creation that tends to pull entire supply chains into existence behind it.</w:t>
+      </w:r>
+    </w:p>
+    <w:p>
+      <w:pPr>
+        <w:ind w:firstLine="720"/>
+      </w:pPr>
+      <w:r>
+        <w:t>What made this feel concrete rather than aspirational was the economic context. Launch costs are dropping as SpaceX, Blue Origin, and others compete. Dr. Lionel mentioned that KPMG has already published extensive reports on the space economy, which means the consulting and investment world is treating this as a real sector, not a curiosity. For someone in a business program, that reframes the space industry from something you read about in the news to something you might actually work in or invest in within the next decade. The shift from government led exploration to commercially driven infrastructure is the same pattern that happened with telecommunications and the internet, and in both of those cases, the business opportunities that emerged were far larger than anyone initially projected.</w:t>
       </w:r>
     </w:p>
     <w:p>
@@ -53,7 +69,15 @@
         <w:ind w:firstLine="720"/>
       </w:pPr>
       <w:r>
-        <w:t>One of the most thought provoking points was that everything learned about building resilient habitats in space will eventually make communities on Earth safer too. The same problems exist here: keeping critical infrastructure running when cascading failures happen, making autonomous decisions when communication is limited, and designing systems that degrade gracefully instead of collapsing. She drew parallels to earthquakes, floods, and submarine life to show that extreme environment engineering always feeds back into everyday engineering. The international dimension also stood out. Countries around the world are contributing components and will need to agree on shared standards, much like maritime standards exist today. Who sets those standards and who benefits from the resulting economy is a geopolitical question as much as a technical one.</w:t>
+        <w:t>The point from the lecture that has stuck with me most is one Dr. Dyke made almost in passing: that learning to embed resilience into space habitats will lead to safer and more resilient communities on Earth. It is easy to hear a talk about the moon and think it has nothing to do with daily life, but the underlying problems are the same ones we face here. How do you keep critical systems running when failures cascade? How do you make decisions autonomously when you cannot call for help? How do you design infrastructure that degrades slowly instead of collapsing? Those questions apply to hospitals during natural disasters, to power grids during extreme weather, and to any system where the stakes are high and the margin for error is small. The research happening at RETH is not just about the moon. It is building a framework for thinking about resilience that transfers directly to problems we already have.</w:t>
+      </w:r>
+    </w:p>
+    <w:p>
+      <w:pPr>
+        <w:ind w:firstLine="720"/>
+      </w:pPr>
+      <w:r>
+        <w:t>The international dimension also raised questions I had not considered. Standards for how components connect, how systems communicate, and how responsibilities are shared across countries are being developed right now, largely through organic collaboration rather than a top down mandate. Who shapes those standards will influence who captures the economic value of the space economy for decades. That is a geopolitical issue as much as an engineering one, and it is happening quietly while most people are not paying attention. It reminded me of how early internet governance shaped the digital economy in ways that still matter today. The decisions being made now about lunar infrastructure standards could have a similarly lasting impact on who leads the next major economic frontier.</w:t>
       </w:r>
     </w:p>
     <w:p>
@@ -71,7 +95,7 @@
         <w:ind w:firstLine="720"/>
       </w:pPr>
       <w:r>
-        <w:t>Before this lecture, I thought of space habitats as distant and theoretical. Dr. Dyke made it feel immediate. The RETH institute has been at Purdue since 2019, building simulation tools, digital twin platforms, and robotic systems for exactly these problems. The detail that stayed with me most was about the International Space Station: even with a small crew, disruptions happen multiple times a week, and dozens of people on the ground monitor every data feed around the clock. A moon base cannot operate that way. It has to be smarter and more autonomous. The Biosphere 2 story was also a good reminder of how much we do not know. That experiment nearly killed its inhabitants because of air quality problems nobody anticipated. If we struggled with a sealed environment on Earth, doing it on the moon with abrasive dust, extreme temperature swings, and no option to step outside is a challenge on a completely different level.</w:t>
+        <w:t>Before this lecture, the idea of a moon base felt abstract to me. Dr. Dyke made it tangible by grounding it in specific, current problems. The detail that hit hardest was about the International Space Station. Even with a small crew, disruptions happen multiple times a week, and there are dozens of people on the ground in Houston monitoring data around the clock. You cannot scale that model to a moon base. There will not be thousands of people sitting on Earth watching every sensor feed. The habitat has to be smart enough to detect problems, diagnose them, and act on its own. That is exactly what RETH has been working on since 2019, and knowing that this research is happening at Purdue made it feel less like a distant ambition and more like something I could actually connect to while I am here. If nothing else, this lecture changed how I think about the word resilience. It is not just about surviving a disruption. It is about designing systems that can sense, respond, and recover without waiting for someone to intervene. That principle applies far beyond space, and it is one I expect to carry with me long after this course is over.</w:t>
       </w:r>
     </w:p>
     <w:sectPr>
@@ -448,7 +472,7 @@
     <w:qFormat/>
     <w:rsid w:val="00FC693F"/>
     <w:pPr>
-      <w:spacing w:after="0" w:before="0" w:line="480" w:lineRule="auto"/>
+      <w:spacing w:after="0" w:before="0" w:line="276" w:lineRule="auto"/>
     </w:pPr>
     <w:rPr>
       <w:rFonts w:ascii="Times New Roman" w:hAnsi="Times New Roman"/>

</xml_diff>